<commit_message>
création commande pour l'admin
</commit_message>
<xml_diff>
--- a/public/generated/Fiche_Intendance_rouff.docx
+++ b/public/generated/Fiche_Intendance_rouff.docx
@@ -3317,7 +3317,7 @@
                                 <w:color w:val="000000"/>
                                 <w:lang w:val="en-US"/>
                               </w:rPr>
-                              <w:t>☐ Tickets   ☐ Externe</w:t>
+                              <w:t>☑ Tickets   ☐ Externe</w:t>
                             </w:r>
                           </w:p>
                         </w:txbxContent>
@@ -3354,7 +3354,7 @@
                           <w:color w:val="000000"/>
                           <w:lang w:val="en-US"/>
                         </w:rPr>
-                        <w:t>☐ Tickets   ☐ Externe</w:t>
+                        <w:t>☑ Tickets   ☐ Externe</w:t>
                       </w:r>
                     </w:p>
                   </w:txbxContent>

</xml_diff>